<commit_message>
add editing of breifieng teksten
</commit_message>
<xml_diff>
--- a/lib/briefing/templates/CC.docx
+++ b/lib/briefing/templates/CC.docx
@@ -730,37 +730,46 @@
     </w:p>
     <w:p>
       <w:pPr>
-        <w:spacing w:before="1077"/>
-      </w:pPr>
-      <w:r>
-        <w:t xml:space="preserve">Binnenkort organiseer je namens </w:t>
-      </w:r>
-      <w:r>
-        <w:t>Company Cursus</w:t>
-      </w:r>
-      <w:r>
-        <w:t xml:space="preserve"> </w:t>
-      </w:r>
-      <w:r>
-        <w:t xml:space="preserve">een </w:t>
-      </w:r>
-      <w:r>
-        <w:t>cursus</w:t>
-      </w:r>
-      <w:r>
-        <w:t xml:space="preserve"> bij een van onze klanten. Alle informatie in deze briefing is aangedragen door de klant zodat je de </w:t>
-      </w:r>
-      <w:r>
-        <w:t>cursus</w:t>
-      </w:r>
-      <w:r>
-        <w:t xml:space="preserve"> </w:t>
-      </w:r>
-      <w:r>
-        <w:t>perfect kan afstemmen op hun situatie en wensen. We benadrukken graag nog even de punten die voor ons belangrijk zijn:</w:t>
-      </w:r>
-    </w:p>
-    <w:p/>
+        <w:spacing w:before="1077" w:after="0" w:line="20" w:lineRule="exact"/>
+        <w:rPr>
+          <w:sz w:val="2"/>
+          <w:szCs w:val="2"/>
+        </w:rPr>
+      </w:pPr>
+    </w:p>
+    <w:p>
+      <w:r>
+        <w:t xml:space="preserve">+++FOR s IN algemeen+++</w:t>
+      </w:r>
+    </w:p>
+    <w:p>
+      <w:r>
+        <w:t xml:space="preserve">+++IF $s.witregel+++</w:t>
+      </w:r>
+    </w:p>
+    <w:p>
+      <w:pPr>
+        <w:rPr>
+          <w:szCs w:val="18"/>
+        </w:rPr>
+      </w:pPr>
+      <w:r>
+        <w:rPr>
+          <w:szCs w:val="18"/>
+        </w:rPr>
+        <w:t xml:space="preserve"/>
+      </w:r>
+    </w:p>
+    <w:p>
+      <w:r>
+        <w:t xml:space="preserve">+++END-IF+++</w:t>
+      </w:r>
+    </w:p>
+    <w:p>
+      <w:r>
+        <w:t xml:space="preserve">+++IF $s.kop+++</w:t>
+      </w:r>
+    </w:p>
     <w:p>
       <w:pPr>
         <w:pStyle w:val="Kop1"/>
@@ -772,268 +781,104 @@
         <w:rPr>
           <w:rFonts w:eastAsia="Noto Sans JP Regular"/>
         </w:rPr>
-        <w:t xml:space="preserve">Onder </w:t>
-      </w:r>
-      <w:r>
-        <w:rPr>
-          <w:rFonts w:eastAsia="Noto Sans JP Regular"/>
-        </w:rPr>
-        <w:t xml:space="preserve">de vlag van </w:t>
-      </w:r>
-      <w:r>
-        <w:rPr>
-          <w:rFonts w:eastAsia="Noto Sans JP Regular"/>
-        </w:rPr>
-        <w:t>Company Cursus</w:t>
-      </w:r>
-    </w:p>
-    <w:p>
-      <w:pPr>
-        <w:rPr>
-          <w:szCs w:val="21"/>
-        </w:rPr>
-      </w:pPr>
-      <w:r>
-        <w:rPr>
-          <w:szCs w:val="21"/>
-        </w:rPr>
-        <w:t xml:space="preserve">Het is voor ons belangrijk dat je bij de klant werkt onder </w:t>
-      </w:r>
-      <w:r>
-        <w:rPr>
-          <w:szCs w:val="21"/>
-        </w:rPr>
-        <w:t>onze vlag</w:t>
-      </w:r>
-      <w:r>
-        <w:rPr>
-          <w:szCs w:val="21"/>
-        </w:rPr>
-        <w:t xml:space="preserve">. Dat houdt in dat je je naar de klant toe presenteert als trainer van </w:t>
-      </w:r>
-      <w:r>
-        <w:rPr>
-          <w:szCs w:val="21"/>
-        </w:rPr>
-        <w:t>Company Cursus</w:t>
-      </w:r>
-      <w:r>
-        <w:rPr>
-          <w:szCs w:val="21"/>
-        </w:rPr>
-        <w:t>.</w:t>
-      </w:r>
-      <w:r>
-        <w:rPr>
-          <w:szCs w:val="21"/>
-        </w:rPr>
-        <w:t xml:space="preserve"> Acquisitie voor het eigen bedrijf </w:t>
-      </w:r>
-      <w:proofErr w:type="spellStart"/>
-      <w:r>
-        <w:rPr>
-          <w:szCs w:val="21"/>
-        </w:rPr>
-        <w:t>cq.</w:t>
-      </w:r>
-      <w:proofErr w:type="spellEnd"/>
-      <w:r>
-        <w:rPr>
-          <w:szCs w:val="21"/>
-        </w:rPr>
-        <w:t xml:space="preserve"> dienstverlening is </w:t>
-      </w:r>
-      <w:r>
-        <w:rPr>
-          <w:szCs w:val="21"/>
-        </w:rPr>
-        <w:t>niet toegestaan.</w:t>
-      </w:r>
-    </w:p>
-    <w:p/>
-    <w:p>
-      <w:pPr>
-        <w:pStyle w:val="Kop1"/>
-      </w:pPr>
-      <w:r>
-        <w:t>Behoefte aan vervolg of aanvullende diensten</w:t>
-      </w:r>
-    </w:p>
-    <w:p>
-      <w:pPr>
-        <w:rPr>
-          <w:szCs w:val="21"/>
-        </w:rPr>
-      </w:pPr>
-      <w:r>
-        <w:rPr>
-          <w:szCs w:val="21"/>
-        </w:rPr>
-        <w:t xml:space="preserve">Indien de klant aanvullende of opvolgende behoeftes heeft kan je dit met ons communiceren, of je kan de klant doorverwijzen naar ons. Wij treden dan in contact met de klant om de mogelijkheden te bespreken. </w:t>
-      </w:r>
-    </w:p>
-    <w:p/>
-    <w:p>
-      <w:pPr>
-        <w:pStyle w:val="Kop1"/>
-        <w:rPr>
-          <w:rFonts w:eastAsia="Noto Sans JP Regular"/>
-        </w:rPr>
-      </w:pPr>
-      <w:r>
-        <w:rPr>
-          <w:rFonts w:eastAsia="Noto Sans JP Regular"/>
-        </w:rPr>
-        <w:t>Materialen</w:t>
-      </w:r>
-    </w:p>
-    <w:p>
-      <w:pPr>
-        <w:rPr>
-          <w:szCs w:val="21"/>
-        </w:rPr>
-      </w:pPr>
-      <w:r>
-        <w:rPr>
-          <w:szCs w:val="21"/>
-        </w:rPr>
-        <w:t xml:space="preserve">Het is </w:t>
-      </w:r>
-      <w:r>
-        <w:rPr>
-          <w:szCs w:val="21"/>
-        </w:rPr>
-        <w:t xml:space="preserve">belangrijk dat alles er professioneel en uniform uit ziet. Alle materialen, presentaties, et cetera, worden daarom in </w:t>
-      </w:r>
-      <w:r>
-        <w:rPr>
-          <w:szCs w:val="21"/>
-        </w:rPr>
-        <w:t xml:space="preserve">de </w:t>
-      </w:r>
-      <w:r>
-        <w:rPr>
-          <w:szCs w:val="21"/>
-        </w:rPr>
-        <w:t>huisstijl</w:t>
-      </w:r>
-      <w:r>
-        <w:rPr>
-          <w:szCs w:val="21"/>
-        </w:rPr>
-        <w:t xml:space="preserve"> van </w:t>
-      </w:r>
-      <w:r>
-        <w:rPr>
-          <w:szCs w:val="21"/>
-        </w:rPr>
-        <w:t>Company Cursus</w:t>
-      </w:r>
-      <w:r>
-        <w:rPr>
-          <w:szCs w:val="21"/>
-        </w:rPr>
-        <w:t xml:space="preserve"> gebruikt tijdens de </w:t>
-      </w:r>
-      <w:r>
-        <w:rPr>
-          <w:szCs w:val="21"/>
-        </w:rPr>
-        <w:t>cursus</w:t>
-      </w:r>
-      <w:r>
-        <w:rPr>
-          <w:szCs w:val="21"/>
-        </w:rPr>
-        <w:t xml:space="preserve">. Heb je materialen die nog niet in onze huisstijl omgezet zijn? Stuur het dan even door zodat we dit voor de </w:t>
-      </w:r>
-      <w:r>
-        <w:rPr>
-          <w:szCs w:val="21"/>
-        </w:rPr>
-        <w:t>cursus</w:t>
-      </w:r>
-      <w:r>
-        <w:rPr>
-          <w:szCs w:val="21"/>
-        </w:rPr>
-        <w:t xml:space="preserve"> kunnen doen.</w:t>
-      </w:r>
-    </w:p>
-    <w:p/>
-    <w:p>
-      <w:pPr>
-        <w:pStyle w:val="Kop1"/>
-        <w:rPr>
-          <w:rFonts w:eastAsia="Noto Sans JP Regular"/>
-        </w:rPr>
-      </w:pPr>
-      <w:r>
-        <w:rPr>
-          <w:rFonts w:eastAsia="Noto Sans JP Regular"/>
-        </w:rPr>
-        <w:t xml:space="preserve">Inhoud </w:t>
-      </w:r>
-      <w:r>
-        <w:rPr>
-          <w:rFonts w:eastAsia="Noto Sans JP Regular"/>
-        </w:rPr>
-        <w:t>cursus</w:t>
-      </w:r>
-    </w:p>
-    <w:p>
-      <w:pPr>
-        <w:rPr>
-          <w:szCs w:val="21"/>
-        </w:rPr>
-      </w:pPr>
-      <w:r>
-        <w:rPr>
-          <w:szCs w:val="21"/>
-        </w:rPr>
-        <w:t xml:space="preserve">De klant heeft de </w:t>
-      </w:r>
-      <w:r>
-        <w:rPr>
-          <w:szCs w:val="21"/>
-        </w:rPr>
-        <w:t>cursus</w:t>
-      </w:r>
-      <w:r>
-        <w:rPr>
-          <w:szCs w:val="21"/>
-        </w:rPr>
-        <w:t xml:space="preserve"> </w:t>
-      </w:r>
-      <w:r>
-        <w:rPr>
-          <w:szCs w:val="21"/>
-        </w:rPr>
-        <w:t xml:space="preserve">geboekt op basis van de content zoals die op onze website te vinden is. Het is belangrijk dat die inhoud tijdens de </w:t>
-      </w:r>
-      <w:r>
-        <w:rPr>
-          <w:szCs w:val="21"/>
-        </w:rPr>
-        <w:t>cursus</w:t>
-      </w:r>
-      <w:r>
-        <w:rPr>
-          <w:szCs w:val="21"/>
-        </w:rPr>
-        <w:t xml:space="preserve"> </w:t>
-      </w:r>
-      <w:r>
-        <w:rPr>
-          <w:szCs w:val="21"/>
-        </w:rPr>
-        <w:t xml:space="preserve">aangeraakt wordt. </w:t>
-      </w:r>
-    </w:p>
-    <w:p/>
-    <w:p>
-      <w:r>
-        <w:t>Vragen? We horen het graag!</w:t>
+        <w:t xml:space="preserve">+++$s.kop+++</w:t>
+      </w:r>
+    </w:p>
+    <w:p>
+      <w:r>
+        <w:t xml:space="preserve">+++END-IF+++</w:t>
+      </w:r>
+    </w:p>
+    <w:p>
+      <w:r>
+        <w:t xml:space="preserve">+++FOR r IN $s.regels+++</w:t>
+      </w:r>
+    </w:p>
+    <w:p>
+      <w:r>
+        <w:t xml:space="preserve">+++IF $r.bullet &amp;&amp; !$r.niveau+++</w:t>
+      </w:r>
+    </w:p>
+    <w:p>
+      <w:pPr>
+        <w:numPr>
+          <w:ilvl w:val="0"/>
+          <w:numId w:val="1"/>
+        </w:numPr>
+        <w:rPr>
+          <w:szCs w:val="18"/>
+        </w:rPr>
+      </w:pPr>
+      <w:r>
+        <w:rPr>
+          <w:szCs w:val="18"/>
+        </w:rPr>
+        <w:t xml:space="preserve">+++$r.tekst+++</w:t>
+      </w:r>
+    </w:p>
+    <w:p>
+      <w:r>
+        <w:t xml:space="preserve">+++END-IF+++</w:t>
+      </w:r>
+    </w:p>
+    <w:p>
+      <w:r>
+        <w:t xml:space="preserve">+++IF $r.bullet &amp;&amp; $r.niveau+++</w:t>
+      </w:r>
+    </w:p>
+    <w:p>
+      <w:pPr>
+        <w:numPr>
+          <w:ilvl w:val="1"/>
+          <w:numId w:val="1"/>
+        </w:numPr>
+        <w:rPr>
+          <w:szCs w:val="18"/>
+        </w:rPr>
+      </w:pPr>
+      <w:r>
+        <w:rPr>
+          <w:szCs w:val="18"/>
+        </w:rPr>
+        <w:t xml:space="preserve">+++$r.tekst+++</w:t>
+      </w:r>
+    </w:p>
+    <w:p>
+      <w:r>
+        <w:t xml:space="preserve">+++END-IF+++</w:t>
+      </w:r>
+    </w:p>
+    <w:p>
+      <w:r>
+        <w:t xml:space="preserve">+++IF !$r.bullet+++</w:t>
+      </w:r>
+    </w:p>
+    <w:p>
+      <w:pPr>
+        <w:rPr>
+          <w:szCs w:val="18"/>
+        </w:rPr>
+      </w:pPr>
+      <w:r>
+        <w:rPr>
+          <w:szCs w:val="18"/>
+        </w:rPr>
+        <w:t xml:space="preserve">+++$r.tekst+++</w:t>
+      </w:r>
+    </w:p>
+    <w:p>
+      <w:r>
+        <w:t xml:space="preserve">+++END-IF+++</w:t>
+      </w:r>
+    </w:p>
+    <w:p>
+      <w:r>
+        <w:t xml:space="preserve">+++END-FOR r+++</w:t>
+      </w:r>
+    </w:p>
+    <w:p>
+      <w:r>
+        <w:t xml:space="preserve">+++END-FOR s+++</w:t>
       </w:r>
     </w:p>
     <w:p/>
@@ -2896,6 +2741,11 @@
       </w:r>
     </w:p>
     <w:p>
+      <w:r>
+        <w:t xml:space="preserve">+++FOR m IN mondayChallenges+++</w:t>
+      </w:r>
+    </w:p>
+    <w:p>
       <w:pPr>
         <w:pStyle w:val="Kop1"/>
         <w:rPr>
@@ -2908,64 +2758,62 @@
           <w:rFonts w:eastAsia="Noto Sans JP Regular"/>
           <w:highlight w:val="cyan"/>
         </w:rPr>
-        <w:lastRenderedPageBreak/>
-        <w:t xml:space="preserve">!! Vergeet de </w:t>
-      </w:r>
-      <w:proofErr w:type="spellStart"/>
-      <w:r>
+        <w:t xml:space="preserve">+++$m+++</w:t>
+      </w:r>
+    </w:p>
+    <w:p>
+      <w:r>
+        <w:t xml:space="preserve">+++END-FOR m+++</w:t>
+      </w:r>
+    </w:p>
+    <w:p>
+      <w:pPr>
+        <w:rPr>
+          <w:szCs w:val="18"/>
+        </w:rPr>
+      </w:pPr>
+      <w:r>
+        <w:rPr>
+          <w:szCs w:val="18"/>
+        </w:rPr>
+        <w:t xml:space="preserve">+++FOR blk IN rolblokken+++</w:t>
+      </w:r>
+    </w:p>
+    <w:p>
+      <w:pPr>
+        <w:rPr>
+          <w:szCs w:val="18"/>
+        </w:rPr>
+      </w:pPr>
+      <w:r>
+        <w:rPr>
+          <w:szCs w:val="18"/>
+        </w:rPr>
+        <w:t xml:space="preserve"/>
+      </w:r>
+    </w:p>
+    <w:p>
+      <w:r>
+        <w:t xml:space="preserve">+++IF $blk.titel+++</w:t>
+      </w:r>
+    </w:p>
+    <w:p>
+      <w:pPr>
+        <w:pStyle w:val="Kop1"/>
         <w:rPr>
           <w:rFonts w:eastAsia="Noto Sans JP Regular"/>
-          <w:highlight w:val="cyan"/>
-        </w:rPr>
-        <w:t>Monday</w:t>
-      </w:r>
-      <w:proofErr w:type="spellEnd"/>
+        </w:rPr>
+      </w:pPr>
       <w:r>
         <w:rPr>
           <w:rFonts w:eastAsia="Noto Sans JP Regular"/>
-          <w:highlight w:val="cyan"/>
-        </w:rPr>
-        <w:t xml:space="preserve"> Challenges niet aan te bieden in je sessie !!</w:t>
-      </w:r>
-    </w:p>
-    <w:p>
-      <w:pPr>
-        <w:rPr>
-          <w:szCs w:val="18"/>
-        </w:rPr>
-      </w:pPr>
-      <w:r>
-        <w:rPr>
-          <w:szCs w:val="18"/>
-        </w:rPr>
-        <w:t xml:space="preserve">+++FOR blk IN rolblokken+++</w:t>
-      </w:r>
-    </w:p>
-    <w:p>
-      <w:pPr>
-        <w:rPr>
-          <w:szCs w:val="18"/>
-        </w:rPr>
-      </w:pPr>
-      <w:r>
-        <w:rPr>
-          <w:szCs w:val="18"/>
-        </w:rPr>
-        <w:t xml:space="preserve"/>
-      </w:r>
-    </w:p>
-    <w:p>
-      <w:pPr>
-        <w:pStyle w:val="Kop1"/>
-        <w:rPr>
-          <w:rFonts w:eastAsia="Noto Sans JP Regular"/>
-        </w:rPr>
-      </w:pPr>
-      <w:r>
-        <w:rPr>
-          <w:rFonts w:eastAsia="Noto Sans JP Regular"/>
         </w:rPr>
         <w:t xml:space="preserve">+++$blk.titel+++</w:t>
+      </w:r>
+    </w:p>
+    <w:p>
+      <w:r>
+        <w:t xml:space="preserve">+++END-IF+++</w:t>
       </w:r>
     </w:p>
     <w:p>
@@ -3133,6 +2981,16 @@
       </w:r>
     </w:p>
     <w:p>
+      <w:r>
+        <w:t xml:space="preserve">+++FOR s IN concept+++</w:t>
+      </w:r>
+    </w:p>
+    <w:p>
+      <w:r>
+        <w:t xml:space="preserve">+++IF $s.witregel+++</w:t>
+      </w:r>
+    </w:p>
+    <w:p>
       <w:pPr>
         <w:rPr>
           <w:szCs w:val="18"/>
@@ -3146,6 +3004,16 @@
       </w:r>
     </w:p>
     <w:p>
+      <w:r>
+        <w:t xml:space="preserve">+++END-IF+++</w:t>
+      </w:r>
+    </w:p>
+    <w:p>
+      <w:r>
+        <w:t xml:space="preserve">+++IF $s.kop+++</w:t>
+      </w:r>
+    </w:p>
+    <w:p>
       <w:pPr>
         <w:pStyle w:val="Kop1"/>
         <w:rPr>
@@ -3156,33 +3024,22 @@
         <w:rPr>
           <w:rFonts w:eastAsia="Noto Sans JP Regular"/>
         </w:rPr>
-        <w:t>Concept inhoud</w:t>
-      </w:r>
-    </w:p>
-    <w:p>
-      <w:pPr>
-        <w:rPr>
-          <w:szCs w:val="18"/>
-        </w:rPr>
-      </w:pPr>
-      <w:r>
-        <w:rPr>
-          <w:szCs w:val="18"/>
-        </w:rPr>
-        <w:t xml:space="preserve">Het volgende concept programma is gecommuniceerd met de klant.</w:t>
-      </w:r>
-    </w:p>
-    <w:p>
-      <w:pPr>
-        <w:rPr>
-          <w:szCs w:val="18"/>
-        </w:rPr>
-      </w:pPr>
-      <w:r>
-        <w:rPr>
-          <w:szCs w:val="18"/>
-        </w:rPr>
-        <w:t xml:space="preserve">+++FOR b IN bullets+++</w:t>
+        <w:t xml:space="preserve">+++$s.kop+++</w:t>
+      </w:r>
+    </w:p>
+    <w:p>
+      <w:r>
+        <w:t xml:space="preserve">+++END-IF+++</w:t>
+      </w:r>
+    </w:p>
+    <w:p>
+      <w:r>
+        <w:t xml:space="preserve">+++FOR r IN $s.regels+++</w:t>
+      </w:r>
+    </w:p>
+    <w:p>
+      <w:r>
+        <w:t xml:space="preserve">+++IF $r.bullet &amp;&amp; !$r.niveau+++</w:t>
       </w:r>
     </w:p>
     <w:p>
@@ -3199,6 +3056,101 @@
         <w:rPr>
           <w:szCs w:val="18"/>
         </w:rPr>
+        <w:t xml:space="preserve">+++$r.tekst+++</w:t>
+      </w:r>
+    </w:p>
+    <w:p>
+      <w:r>
+        <w:t xml:space="preserve">+++END-IF+++</w:t>
+      </w:r>
+    </w:p>
+    <w:p>
+      <w:r>
+        <w:t xml:space="preserve">+++IF $r.bullet &amp;&amp; $r.niveau+++</w:t>
+      </w:r>
+    </w:p>
+    <w:p>
+      <w:pPr>
+        <w:numPr>
+          <w:ilvl w:val="1"/>
+          <w:numId w:val="1"/>
+        </w:numPr>
+        <w:rPr>
+          <w:szCs w:val="18"/>
+        </w:rPr>
+      </w:pPr>
+      <w:r>
+        <w:rPr>
+          <w:szCs w:val="18"/>
+        </w:rPr>
+        <w:t xml:space="preserve">+++$r.tekst+++</w:t>
+      </w:r>
+    </w:p>
+    <w:p>
+      <w:r>
+        <w:t xml:space="preserve">+++END-IF+++</w:t>
+      </w:r>
+    </w:p>
+    <w:p>
+      <w:r>
+        <w:t xml:space="preserve">+++IF !$r.bullet+++</w:t>
+      </w:r>
+    </w:p>
+    <w:p>
+      <w:pPr>
+        <w:rPr>
+          <w:szCs w:val="18"/>
+        </w:rPr>
+      </w:pPr>
+      <w:r>
+        <w:rPr>
+          <w:szCs w:val="18"/>
+        </w:rPr>
+        <w:t xml:space="preserve">+++$r.tekst+++</w:t>
+      </w:r>
+    </w:p>
+    <w:p>
+      <w:r>
+        <w:t xml:space="preserve">+++END-IF+++</w:t>
+      </w:r>
+    </w:p>
+    <w:p>
+      <w:r>
+        <w:t xml:space="preserve">+++END-FOR r+++</w:t>
+      </w:r>
+    </w:p>
+    <w:p>
+      <w:r>
+        <w:t xml:space="preserve">+++END-FOR s+++</w:t>
+      </w:r>
+    </w:p>
+    <w:p>
+      <w:pPr>
+        <w:rPr>
+          <w:szCs w:val="18"/>
+        </w:rPr>
+      </w:pPr>
+      <w:r>
+        <w:rPr>
+          <w:szCs w:val="18"/>
+        </w:rPr>
+        <w:t xml:space="preserve">+++FOR b IN bullets+++</w:t>
+      </w:r>
+    </w:p>
+    <w:p>
+      <w:pPr>
+        <w:numPr>
+          <w:ilvl w:val="0"/>
+          <w:numId w:val="1"/>
+        </w:numPr>
+        <w:rPr>
+          <w:szCs w:val="18"/>
+        </w:rPr>
+      </w:pPr>
+      <w:r>
+        <w:rPr>
+          <w:szCs w:val="18"/>
+        </w:rPr>
         <w:t xml:space="preserve">+++$b+++</w:t>
       </w:r>
     </w:p>
@@ -3242,6 +3194,11 @@
       </w:r>
     </w:p>
     <w:p>
+      <w:r>
+        <w:t xml:space="preserve">+++IF $blk.titel+++</w:t>
+      </w:r>
+    </w:p>
+    <w:p>
       <w:pPr>
         <w:pStyle w:val="Kop1"/>
         <w:rPr>
@@ -3253,6 +3210,11 @@
           <w:rFonts w:eastAsia="Noto Sans JP Regular"/>
         </w:rPr>
         <w:t xml:space="preserve">+++$blk.titel+++</w:t>
+      </w:r>
+    </w:p>
+    <w:p>
+      <w:r>
+        <w:t xml:space="preserve">+++END-IF+++</w:t>
       </w:r>
     </w:p>
     <w:p>
@@ -3873,6 +3835,16 @@
       </w:r>
     </w:p>
     <w:p>
+      <w:r>
+        <w:t xml:space="preserve">+++FOR s IN inventarisatieIntro+++</w:t>
+      </w:r>
+    </w:p>
+    <w:p>
+      <w:r>
+        <w:t xml:space="preserve">+++IF $s.witregel+++</w:t>
+      </w:r>
+    </w:p>
+    <w:p>
       <w:pPr>
         <w:rPr>
           <w:szCs w:val="18"/>
@@ -3886,6 +3858,16 @@
       </w:r>
     </w:p>
     <w:p>
+      <w:r>
+        <w:t xml:space="preserve">+++END-IF+++</w:t>
+      </w:r>
+    </w:p>
+    <w:p>
+      <w:r>
+        <w:t xml:space="preserve">+++IF $s.kop+++</w:t>
+      </w:r>
+    </w:p>
+    <w:p>
       <w:pPr>
         <w:pStyle w:val="Kop1"/>
         <w:rPr>
@@ -3896,20 +3878,104 @@
         <w:rPr>
           <w:rFonts w:eastAsia="Noto Sans JP Regular"/>
         </w:rPr>
-        <w:t>Inventarisatie klant</w:t>
-      </w:r>
-    </w:p>
-    <w:p>
-      <w:pPr>
-        <w:rPr>
-          <w:szCs w:val="18"/>
-        </w:rPr>
-      </w:pPr>
-      <w:r>
-        <w:rPr>
-          <w:szCs w:val="18"/>
-        </w:rPr>
-        <w:t xml:space="preserve">Onderstaande informatie komt uit het inventarisatieformulier. Gebruik de context en casuïstiek als input voor de workshop.</w:t>
+        <w:t xml:space="preserve">+++$s.kop+++</w:t>
+      </w:r>
+    </w:p>
+    <w:p>
+      <w:r>
+        <w:t xml:space="preserve">+++END-IF+++</w:t>
+      </w:r>
+    </w:p>
+    <w:p>
+      <w:r>
+        <w:t xml:space="preserve">+++FOR r IN $s.regels+++</w:t>
+      </w:r>
+    </w:p>
+    <w:p>
+      <w:r>
+        <w:t xml:space="preserve">+++IF $r.bullet &amp;&amp; !$r.niveau+++</w:t>
+      </w:r>
+    </w:p>
+    <w:p>
+      <w:pPr>
+        <w:numPr>
+          <w:ilvl w:val="0"/>
+          <w:numId w:val="1"/>
+        </w:numPr>
+        <w:rPr>
+          <w:szCs w:val="18"/>
+        </w:rPr>
+      </w:pPr>
+      <w:r>
+        <w:rPr>
+          <w:szCs w:val="18"/>
+        </w:rPr>
+        <w:t xml:space="preserve">+++$r.tekst+++</w:t>
+      </w:r>
+    </w:p>
+    <w:p>
+      <w:r>
+        <w:t xml:space="preserve">+++END-IF+++</w:t>
+      </w:r>
+    </w:p>
+    <w:p>
+      <w:r>
+        <w:t xml:space="preserve">+++IF $r.bullet &amp;&amp; $r.niveau+++</w:t>
+      </w:r>
+    </w:p>
+    <w:p>
+      <w:pPr>
+        <w:numPr>
+          <w:ilvl w:val="1"/>
+          <w:numId w:val="1"/>
+        </w:numPr>
+        <w:rPr>
+          <w:szCs w:val="18"/>
+        </w:rPr>
+      </w:pPr>
+      <w:r>
+        <w:rPr>
+          <w:szCs w:val="18"/>
+        </w:rPr>
+        <w:t xml:space="preserve">+++$r.tekst+++</w:t>
+      </w:r>
+    </w:p>
+    <w:p>
+      <w:r>
+        <w:t xml:space="preserve">+++END-IF+++</w:t>
+      </w:r>
+    </w:p>
+    <w:p>
+      <w:r>
+        <w:t xml:space="preserve">+++IF !$r.bullet+++</w:t>
+      </w:r>
+    </w:p>
+    <w:p>
+      <w:pPr>
+        <w:rPr>
+          <w:szCs w:val="18"/>
+        </w:rPr>
+      </w:pPr>
+      <w:r>
+        <w:rPr>
+          <w:szCs w:val="18"/>
+        </w:rPr>
+        <w:t xml:space="preserve">+++$r.tekst+++</w:t>
+      </w:r>
+    </w:p>
+    <w:p>
+      <w:r>
+        <w:t xml:space="preserve">+++END-IF+++</w:t>
+      </w:r>
+    </w:p>
+    <w:p>
+      <w:r>
+        <w:t xml:space="preserve">+++END-FOR r+++</w:t>
+      </w:r>
+    </w:p>
+    <w:p>
+      <w:r>
+        <w:t xml:space="preserve">+++END-FOR s+++</w:t>
       </w:r>
     </w:p>
     <w:p>
@@ -4004,16 +4070,147 @@
       </w:r>
     </w:p>
     <w:p>
-      <w:pPr>
-        <w:rPr>
-          <w:szCs w:val="18"/>
-        </w:rPr>
-      </w:pPr>
-      <w:r>
-        <w:rPr>
-          <w:szCs w:val="18"/>
-        </w:rPr>
-        <w:t xml:space="preserve">Het inventarisatieformulier is (nog) niet ingevuld door de klant.</w:t>
+      <w:r>
+        <w:t xml:space="preserve">+++FOR s IN inventarisatieLeeg+++</w:t>
+      </w:r>
+    </w:p>
+    <w:p>
+      <w:r>
+        <w:t xml:space="preserve">+++IF $s.witregel+++</w:t>
+      </w:r>
+    </w:p>
+    <w:p>
+      <w:pPr>
+        <w:rPr>
+          <w:szCs w:val="18"/>
+        </w:rPr>
+      </w:pPr>
+      <w:r>
+        <w:rPr>
+          <w:szCs w:val="18"/>
+        </w:rPr>
+        <w:t xml:space="preserve"/>
+      </w:r>
+    </w:p>
+    <w:p>
+      <w:r>
+        <w:t xml:space="preserve">+++END-IF+++</w:t>
+      </w:r>
+    </w:p>
+    <w:p>
+      <w:r>
+        <w:t xml:space="preserve">+++IF $s.kop+++</w:t>
+      </w:r>
+    </w:p>
+    <w:p>
+      <w:pPr>
+        <w:pStyle w:val="Kop1"/>
+        <w:rPr>
+          <w:rFonts w:eastAsia="Noto Sans JP Regular"/>
+        </w:rPr>
+      </w:pPr>
+      <w:r>
+        <w:rPr>
+          <w:rFonts w:eastAsia="Noto Sans JP Regular"/>
+        </w:rPr>
+        <w:t xml:space="preserve">+++$s.kop+++</w:t>
+      </w:r>
+    </w:p>
+    <w:p>
+      <w:r>
+        <w:t xml:space="preserve">+++END-IF+++</w:t>
+      </w:r>
+    </w:p>
+    <w:p>
+      <w:r>
+        <w:t xml:space="preserve">+++FOR r IN $s.regels+++</w:t>
+      </w:r>
+    </w:p>
+    <w:p>
+      <w:r>
+        <w:t xml:space="preserve">+++IF $r.bullet &amp;&amp; !$r.niveau+++</w:t>
+      </w:r>
+    </w:p>
+    <w:p>
+      <w:pPr>
+        <w:numPr>
+          <w:ilvl w:val="0"/>
+          <w:numId w:val="1"/>
+        </w:numPr>
+        <w:rPr>
+          <w:szCs w:val="18"/>
+        </w:rPr>
+      </w:pPr>
+      <w:r>
+        <w:rPr>
+          <w:szCs w:val="18"/>
+        </w:rPr>
+        <w:t xml:space="preserve">+++$r.tekst+++</w:t>
+      </w:r>
+    </w:p>
+    <w:p>
+      <w:r>
+        <w:t xml:space="preserve">+++END-IF+++</w:t>
+      </w:r>
+    </w:p>
+    <w:p>
+      <w:r>
+        <w:t xml:space="preserve">+++IF $r.bullet &amp;&amp; $r.niveau+++</w:t>
+      </w:r>
+    </w:p>
+    <w:p>
+      <w:pPr>
+        <w:numPr>
+          <w:ilvl w:val="1"/>
+          <w:numId w:val="1"/>
+        </w:numPr>
+        <w:rPr>
+          <w:szCs w:val="18"/>
+        </w:rPr>
+      </w:pPr>
+      <w:r>
+        <w:rPr>
+          <w:szCs w:val="18"/>
+        </w:rPr>
+        <w:t xml:space="preserve">+++$r.tekst+++</w:t>
+      </w:r>
+    </w:p>
+    <w:p>
+      <w:r>
+        <w:t xml:space="preserve">+++END-IF+++</w:t>
+      </w:r>
+    </w:p>
+    <w:p>
+      <w:r>
+        <w:t xml:space="preserve">+++IF !$r.bullet+++</w:t>
+      </w:r>
+    </w:p>
+    <w:p>
+      <w:pPr>
+        <w:rPr>
+          <w:szCs w:val="18"/>
+        </w:rPr>
+      </w:pPr>
+      <w:r>
+        <w:rPr>
+          <w:szCs w:val="18"/>
+        </w:rPr>
+        <w:t xml:space="preserve">+++$r.tekst+++</w:t>
+      </w:r>
+    </w:p>
+    <w:p>
+      <w:r>
+        <w:t xml:space="preserve">+++END-IF+++</w:t>
+      </w:r>
+    </w:p>
+    <w:p>
+      <w:r>
+        <w:t xml:space="preserve">+++END-FOR r+++</w:t>
+      </w:r>
+    </w:p>
+    <w:p>
+      <w:r>
+        <w:t xml:space="preserve">+++END-FOR s+++</w:t>
       </w:r>
     </w:p>
     <w:p>

</xml_diff>

<commit_message>
change color of warning and achtergrond info formattign
</commit_message>
<xml_diff>
--- a/lib/briefing/templates/CC.docx
+++ b/lib/briefing/templates/CC.docx
@@ -2072,6 +2072,11 @@
       <w:proofErr w:type="spellEnd"/>
     </w:p>
     <w:p>
+      <w:r>
+        <w:t xml:space="preserve">+++IF $a.kop+++</w:t>
+      </w:r>
+    </w:p>
+    <w:p>
       <w:pPr>
         <w:rPr>
           <w:lang w:val="en-US" w:eastAsia="nl-NL"/>
@@ -2079,76 +2084,172 @@
       </w:pPr>
       <w:r>
         <w:rPr>
+          <w:b/>
+          <w:bCs/>
           <w:lang w:val="en-US" w:eastAsia="nl-NL"/>
         </w:rPr>
-        <w:t xml:space="preserve">+++$a+++</w:t>
-      </w:r>
-      <w:proofErr w:type="spellStart"/>
-      <w:proofErr w:type="spellEnd"/>
-      <w:proofErr w:type="spellStart"/>
-      <w:proofErr w:type="spellEnd"/>
-      <w:proofErr w:type="spellStart"/>
-      <w:proofErr w:type="spellEnd"/>
-      <w:proofErr w:type="spellStart"/>
-      <w:proofErr w:type="spellEnd"/>
-      <w:proofErr w:type="spellStart"/>
-      <w:proofErr w:type="spellEnd"/>
-      <w:proofErr w:type="spellStart"/>
-      <w:proofErr w:type="spellEnd"/>
-      <w:proofErr w:type="spellStart"/>
-      <w:proofErr w:type="spellEnd"/>
-      <w:proofErr w:type="spellStart"/>
-      <w:proofErr w:type="spellEnd"/>
-      <w:proofErr w:type="spellStart"/>
-      <w:proofErr w:type="spellEnd"/>
-      <w:proofErr w:type="spellStart"/>
-      <w:proofErr w:type="spellEnd"/>
-      <w:proofErr w:type="spellStart"/>
-      <w:proofErr w:type="spellEnd"/>
-      <w:proofErr w:type="spellStart"/>
-      <w:proofErr w:type="spellEnd"/>
-      <w:proofErr w:type="spellStart"/>
-      <w:proofErr w:type="spellEnd"/>
-      <w:proofErr w:type="spellStart"/>
-      <w:proofErr w:type="spellEnd"/>
-      <w:proofErr w:type="spellStart"/>
-      <w:proofErr w:type="spellEnd"/>
-      <w:proofErr w:type="spellStart"/>
-      <w:proofErr w:type="spellEnd"/>
-      <w:proofErr w:type="spellStart"/>
-      <w:proofErr w:type="spellEnd"/>
-      <w:proofErr w:type="spellStart"/>
-      <w:proofErr w:type="spellEnd"/>
-      <w:proofErr w:type="spellStart"/>
-      <w:proofErr w:type="spellEnd"/>
-      <w:proofErr w:type="spellStart"/>
-      <w:proofErr w:type="spellEnd"/>
-      <w:proofErr w:type="spellStart"/>
-      <w:proofErr w:type="spellEnd"/>
-      <w:proofErr w:type="spellStart"/>
-      <w:proofErr w:type="spellEnd"/>
-      <w:proofErr w:type="spellStart"/>
-      <w:proofErr w:type="spellEnd"/>
-      <w:proofErr w:type="spellStart"/>
-      <w:proofErr w:type="spellEnd"/>
-      <w:proofErr w:type="spellStart"/>
-      <w:proofErr w:type="spellEnd"/>
-      <w:proofErr w:type="spellStart"/>
-      <w:proofErr w:type="spellEnd"/>
-      <w:proofErr w:type="spellStart"/>
-      <w:proofErr w:type="spellEnd"/>
-      <w:proofErr w:type="spellStart"/>
-      <w:proofErr w:type="spellEnd"/>
-      <w:proofErr w:type="spellStart"/>
-      <w:proofErr w:type="spellEnd"/>
-      <w:proofErr w:type="spellStart"/>
-      <w:proofErr w:type="spellEnd"/>
-      <w:proofErr w:type="spellStart"/>
-      <w:proofErr w:type="spellEnd"/>
-      <w:proofErr w:type="spellStart"/>
-      <w:proofErr w:type="spellEnd"/>
-      <w:proofErr w:type="spellStart"/>
-      <w:proofErr w:type="spellEnd"/>
+        <w:t xml:space="preserve">+++$a.tekst+++</w:t>
+      </w:r>
+      <w:proofErr w:type="spellStart"/>
+      <w:proofErr w:type="spellEnd"/>
+      <w:proofErr w:type="spellStart"/>
+      <w:proofErr w:type="spellEnd"/>
+      <w:proofErr w:type="spellStart"/>
+      <w:proofErr w:type="spellEnd"/>
+      <w:proofErr w:type="spellStart"/>
+      <w:proofErr w:type="spellEnd"/>
+      <w:proofErr w:type="spellStart"/>
+      <w:proofErr w:type="spellEnd"/>
+      <w:proofErr w:type="spellStart"/>
+      <w:proofErr w:type="spellEnd"/>
+      <w:proofErr w:type="spellStart"/>
+      <w:proofErr w:type="spellEnd"/>
+      <w:proofErr w:type="spellStart"/>
+      <w:proofErr w:type="spellEnd"/>
+      <w:proofErr w:type="spellStart"/>
+      <w:proofErr w:type="spellEnd"/>
+      <w:proofErr w:type="spellStart"/>
+      <w:proofErr w:type="spellEnd"/>
+      <w:proofErr w:type="spellStart"/>
+      <w:proofErr w:type="spellEnd"/>
+      <w:proofErr w:type="spellStart"/>
+      <w:proofErr w:type="spellEnd"/>
+      <w:proofErr w:type="spellStart"/>
+      <w:proofErr w:type="spellEnd"/>
+      <w:proofErr w:type="spellStart"/>
+      <w:proofErr w:type="spellEnd"/>
+      <w:proofErr w:type="spellStart"/>
+      <w:proofErr w:type="spellEnd"/>
+      <w:proofErr w:type="spellStart"/>
+      <w:proofErr w:type="spellEnd"/>
+      <w:proofErr w:type="spellStart"/>
+      <w:proofErr w:type="spellEnd"/>
+      <w:proofErr w:type="spellStart"/>
+      <w:proofErr w:type="spellEnd"/>
+      <w:proofErr w:type="spellStart"/>
+      <w:proofErr w:type="spellEnd"/>
+      <w:proofErr w:type="spellStart"/>
+      <w:proofErr w:type="spellEnd"/>
+      <w:proofErr w:type="spellStart"/>
+      <w:proofErr w:type="spellEnd"/>
+      <w:proofErr w:type="spellStart"/>
+      <w:proofErr w:type="spellEnd"/>
+      <w:proofErr w:type="spellStart"/>
+      <w:proofErr w:type="spellEnd"/>
+      <w:proofErr w:type="spellStart"/>
+      <w:proofErr w:type="spellEnd"/>
+      <w:proofErr w:type="spellStart"/>
+      <w:proofErr w:type="spellEnd"/>
+      <w:proofErr w:type="spellStart"/>
+      <w:proofErr w:type="spellEnd"/>
+      <w:proofErr w:type="spellStart"/>
+      <w:proofErr w:type="spellEnd"/>
+      <w:proofErr w:type="spellStart"/>
+      <w:proofErr w:type="spellEnd"/>
+      <w:proofErr w:type="spellStart"/>
+      <w:proofErr w:type="spellEnd"/>
+      <w:proofErr w:type="spellStart"/>
+      <w:proofErr w:type="spellEnd"/>
+      <w:proofErr w:type="spellStart"/>
+      <w:proofErr w:type="spellEnd"/>
+      <w:proofErr w:type="spellStart"/>
+      <w:proofErr w:type="spellEnd"/>
+      <w:proofErr w:type="spellStart"/>
+      <w:proofErr w:type="spellEnd"/>
+    </w:p>
+    <w:p>
+      <w:r>
+        <w:t xml:space="preserve">+++END-IF+++</w:t>
+      </w:r>
+    </w:p>
+    <w:p>
+      <w:r>
+        <w:t xml:space="preserve">+++IF !$a.kop+++</w:t>
+      </w:r>
+    </w:p>
+    <w:p>
+      <w:pPr>
+        <w:rPr>
+          <w:lang w:val="en-US" w:eastAsia="nl-NL"/>
+        </w:rPr>
+      </w:pPr>
+      <w:r>
+        <w:rPr>
+          <w:lang w:val="en-US" w:eastAsia="nl-NL"/>
+        </w:rPr>
+        <w:t xml:space="preserve">+++$a.tekst+++</w:t>
+      </w:r>
+      <w:proofErr w:type="spellStart"/>
+      <w:proofErr w:type="spellEnd"/>
+      <w:proofErr w:type="spellStart"/>
+      <w:proofErr w:type="spellEnd"/>
+      <w:proofErr w:type="spellStart"/>
+      <w:proofErr w:type="spellEnd"/>
+      <w:proofErr w:type="spellStart"/>
+      <w:proofErr w:type="spellEnd"/>
+      <w:proofErr w:type="spellStart"/>
+      <w:proofErr w:type="spellEnd"/>
+      <w:proofErr w:type="spellStart"/>
+      <w:proofErr w:type="spellEnd"/>
+      <w:proofErr w:type="spellStart"/>
+      <w:proofErr w:type="spellEnd"/>
+      <w:proofErr w:type="spellStart"/>
+      <w:proofErr w:type="spellEnd"/>
+      <w:proofErr w:type="spellStart"/>
+      <w:proofErr w:type="spellEnd"/>
+      <w:proofErr w:type="spellStart"/>
+      <w:proofErr w:type="spellEnd"/>
+      <w:proofErr w:type="spellStart"/>
+      <w:proofErr w:type="spellEnd"/>
+      <w:proofErr w:type="spellStart"/>
+      <w:proofErr w:type="spellEnd"/>
+      <w:proofErr w:type="spellStart"/>
+      <w:proofErr w:type="spellEnd"/>
+      <w:proofErr w:type="spellStart"/>
+      <w:proofErr w:type="spellEnd"/>
+      <w:proofErr w:type="spellStart"/>
+      <w:proofErr w:type="spellEnd"/>
+      <w:proofErr w:type="spellStart"/>
+      <w:proofErr w:type="spellEnd"/>
+      <w:proofErr w:type="spellStart"/>
+      <w:proofErr w:type="spellEnd"/>
+      <w:proofErr w:type="spellStart"/>
+      <w:proofErr w:type="spellEnd"/>
+      <w:proofErr w:type="spellStart"/>
+      <w:proofErr w:type="spellEnd"/>
+      <w:proofErr w:type="spellStart"/>
+      <w:proofErr w:type="spellEnd"/>
+      <w:proofErr w:type="spellStart"/>
+      <w:proofErr w:type="spellEnd"/>
+      <w:proofErr w:type="spellStart"/>
+      <w:proofErr w:type="spellEnd"/>
+      <w:proofErr w:type="spellStart"/>
+      <w:proofErr w:type="spellEnd"/>
+      <w:proofErr w:type="spellStart"/>
+      <w:proofErr w:type="spellEnd"/>
+      <w:proofErr w:type="spellStart"/>
+      <w:proofErr w:type="spellEnd"/>
+      <w:proofErr w:type="spellStart"/>
+      <w:proofErr w:type="spellEnd"/>
+      <w:proofErr w:type="spellStart"/>
+      <w:proofErr w:type="spellEnd"/>
+      <w:proofErr w:type="spellStart"/>
+      <w:proofErr w:type="spellEnd"/>
+      <w:proofErr w:type="spellStart"/>
+      <w:proofErr w:type="spellEnd"/>
+      <w:proofErr w:type="spellStart"/>
+      <w:proofErr w:type="spellEnd"/>
+      <w:proofErr w:type="spellStart"/>
+      <w:proofErr w:type="spellEnd"/>
+      <w:proofErr w:type="spellStart"/>
+      <w:proofErr w:type="spellEnd"/>
+      <w:proofErr w:type="spellStart"/>
+      <w:proofErr w:type="spellEnd"/>
+    </w:p>
+    <w:p>
+      <w:r>
+        <w:t xml:space="preserve">+++END-IF+++</w:t>
+      </w:r>
     </w:p>
     <w:p>
       <w:pPr>

</xml_diff>

<commit_message>
add inventarisatie answers in breifing and tab
</commit_message>
<xml_diff>
--- a/lib/briefing/templates/CC.docx
+++ b/lib/briefing/templates/CC.docx
@@ -4111,8 +4111,17 @@
           <w:szCs w:val="18"/>
         </w:rPr>
       </w:pPr>
-      <w:r>
-        <w:rPr>
+    </w:p>
+    <w:p>
+      <w:pPr>
+        <w:rPr>
+          <w:szCs w:val="18"/>
+        </w:rPr>
+      </w:pPr>
+      <w:r>
+        <w:rPr>
+          <w:b/>
+          <w:bCs/>
           <w:szCs w:val="18"/>
         </w:rPr>
         <w:t xml:space="preserve">+++$v.vraag+++</w:t>

</xml_diff>

<commit_message>
add doc for achtergrond info
</commit_message>
<xml_diff>
--- a/lib/briefing/templates/CC.docx
+++ b/lib/briefing/templates/CC.docx
@@ -2073,7 +2073,193 @@
     </w:p>
     <w:p>
       <w:r>
-        <w:t xml:space="preserve">+++IF $a.kop+++</w:t>
+        <w:t xml:space="preserve">+++IF $a.niveau === 1+++</w:t>
+      </w:r>
+    </w:p>
+    <w:p>
+      <w:pPr>
+        <w:rPr>
+          <w:lang w:val="en-US" w:eastAsia="nl-NL"/>
+        </w:rPr>
+      </w:pPr>
+      <w:r>
+        <w:rPr>
+          <w:b/>
+          <w:bCs/>
+          <w:sz w:val="27"/>
+          <w:szCs w:val="27"/>
+          <w:lang w:val="en-US" w:eastAsia="nl-NL"/>
+        </w:rPr>
+        <w:t xml:space="preserve">+++$a.tekst+++</w:t>
+      </w:r>
+      <w:proofErr w:type="spellStart"/>
+      <w:proofErr w:type="spellEnd"/>
+      <w:proofErr w:type="spellStart"/>
+      <w:proofErr w:type="spellEnd"/>
+      <w:proofErr w:type="spellStart"/>
+      <w:proofErr w:type="spellEnd"/>
+      <w:proofErr w:type="spellStart"/>
+      <w:proofErr w:type="spellEnd"/>
+      <w:proofErr w:type="spellStart"/>
+      <w:proofErr w:type="spellEnd"/>
+      <w:proofErr w:type="spellStart"/>
+      <w:proofErr w:type="spellEnd"/>
+      <w:proofErr w:type="spellStart"/>
+      <w:proofErr w:type="spellEnd"/>
+      <w:proofErr w:type="spellStart"/>
+      <w:proofErr w:type="spellEnd"/>
+      <w:proofErr w:type="spellStart"/>
+      <w:proofErr w:type="spellEnd"/>
+      <w:proofErr w:type="spellStart"/>
+      <w:proofErr w:type="spellEnd"/>
+      <w:proofErr w:type="spellStart"/>
+      <w:proofErr w:type="spellEnd"/>
+      <w:proofErr w:type="spellStart"/>
+      <w:proofErr w:type="spellEnd"/>
+      <w:proofErr w:type="spellStart"/>
+      <w:proofErr w:type="spellEnd"/>
+      <w:proofErr w:type="spellStart"/>
+      <w:proofErr w:type="spellEnd"/>
+      <w:proofErr w:type="spellStart"/>
+      <w:proofErr w:type="spellEnd"/>
+      <w:proofErr w:type="spellStart"/>
+      <w:proofErr w:type="spellEnd"/>
+      <w:proofErr w:type="spellStart"/>
+      <w:proofErr w:type="spellEnd"/>
+      <w:proofErr w:type="spellStart"/>
+      <w:proofErr w:type="spellEnd"/>
+      <w:proofErr w:type="spellStart"/>
+      <w:proofErr w:type="spellEnd"/>
+      <w:proofErr w:type="spellStart"/>
+      <w:proofErr w:type="spellEnd"/>
+      <w:proofErr w:type="spellStart"/>
+      <w:proofErr w:type="spellEnd"/>
+      <w:proofErr w:type="spellStart"/>
+      <w:proofErr w:type="spellEnd"/>
+      <w:proofErr w:type="spellStart"/>
+      <w:proofErr w:type="spellEnd"/>
+      <w:proofErr w:type="spellStart"/>
+      <w:proofErr w:type="spellEnd"/>
+      <w:proofErr w:type="spellStart"/>
+      <w:proofErr w:type="spellEnd"/>
+      <w:proofErr w:type="spellStart"/>
+      <w:proofErr w:type="spellEnd"/>
+      <w:proofErr w:type="spellStart"/>
+      <w:proofErr w:type="spellEnd"/>
+      <w:proofErr w:type="spellStart"/>
+      <w:proofErr w:type="spellEnd"/>
+      <w:proofErr w:type="spellStart"/>
+      <w:proofErr w:type="spellEnd"/>
+      <w:proofErr w:type="spellStart"/>
+      <w:proofErr w:type="spellEnd"/>
+      <w:proofErr w:type="spellStart"/>
+      <w:proofErr w:type="spellEnd"/>
+      <w:proofErr w:type="spellStart"/>
+      <w:proofErr w:type="spellEnd"/>
+      <w:proofErr w:type="spellStart"/>
+      <w:proofErr w:type="spellEnd"/>
+    </w:p>
+    <w:p>
+      <w:r>
+        <w:t xml:space="preserve">+++END-IF+++</w:t>
+      </w:r>
+    </w:p>
+    <w:p>
+      <w:r>
+        <w:t xml:space="preserve">+++IF $a.niveau === 2+++</w:t>
+      </w:r>
+    </w:p>
+    <w:p>
+      <w:pPr>
+        <w:rPr>
+          <w:lang w:val="en-US" w:eastAsia="nl-NL"/>
+        </w:rPr>
+      </w:pPr>
+      <w:r>
+        <w:rPr>
+          <w:b/>
+          <w:bCs/>
+          <w:sz w:val="26"/>
+          <w:szCs w:val="26"/>
+          <w:lang w:val="en-US" w:eastAsia="nl-NL"/>
+        </w:rPr>
+        <w:t xml:space="preserve">+++$a.tekst+++</w:t>
+      </w:r>
+      <w:proofErr w:type="spellStart"/>
+      <w:proofErr w:type="spellEnd"/>
+      <w:proofErr w:type="spellStart"/>
+      <w:proofErr w:type="spellEnd"/>
+      <w:proofErr w:type="spellStart"/>
+      <w:proofErr w:type="spellEnd"/>
+      <w:proofErr w:type="spellStart"/>
+      <w:proofErr w:type="spellEnd"/>
+      <w:proofErr w:type="spellStart"/>
+      <w:proofErr w:type="spellEnd"/>
+      <w:proofErr w:type="spellStart"/>
+      <w:proofErr w:type="spellEnd"/>
+      <w:proofErr w:type="spellStart"/>
+      <w:proofErr w:type="spellEnd"/>
+      <w:proofErr w:type="spellStart"/>
+      <w:proofErr w:type="spellEnd"/>
+      <w:proofErr w:type="spellStart"/>
+      <w:proofErr w:type="spellEnd"/>
+      <w:proofErr w:type="spellStart"/>
+      <w:proofErr w:type="spellEnd"/>
+      <w:proofErr w:type="spellStart"/>
+      <w:proofErr w:type="spellEnd"/>
+      <w:proofErr w:type="spellStart"/>
+      <w:proofErr w:type="spellEnd"/>
+      <w:proofErr w:type="spellStart"/>
+      <w:proofErr w:type="spellEnd"/>
+      <w:proofErr w:type="spellStart"/>
+      <w:proofErr w:type="spellEnd"/>
+      <w:proofErr w:type="spellStart"/>
+      <w:proofErr w:type="spellEnd"/>
+      <w:proofErr w:type="spellStart"/>
+      <w:proofErr w:type="spellEnd"/>
+      <w:proofErr w:type="spellStart"/>
+      <w:proofErr w:type="spellEnd"/>
+      <w:proofErr w:type="spellStart"/>
+      <w:proofErr w:type="spellEnd"/>
+      <w:proofErr w:type="spellStart"/>
+      <w:proofErr w:type="spellEnd"/>
+      <w:proofErr w:type="spellStart"/>
+      <w:proofErr w:type="spellEnd"/>
+      <w:proofErr w:type="spellStart"/>
+      <w:proofErr w:type="spellEnd"/>
+      <w:proofErr w:type="spellStart"/>
+      <w:proofErr w:type="spellEnd"/>
+      <w:proofErr w:type="spellStart"/>
+      <w:proofErr w:type="spellEnd"/>
+      <w:proofErr w:type="spellStart"/>
+      <w:proofErr w:type="spellEnd"/>
+      <w:proofErr w:type="spellStart"/>
+      <w:proofErr w:type="spellEnd"/>
+      <w:proofErr w:type="spellStart"/>
+      <w:proofErr w:type="spellEnd"/>
+      <w:proofErr w:type="spellStart"/>
+      <w:proofErr w:type="spellEnd"/>
+      <w:proofErr w:type="spellStart"/>
+      <w:proofErr w:type="spellEnd"/>
+      <w:proofErr w:type="spellStart"/>
+      <w:proofErr w:type="spellEnd"/>
+      <w:proofErr w:type="spellStart"/>
+      <w:proofErr w:type="spellEnd"/>
+      <w:proofErr w:type="spellStart"/>
+      <w:proofErr w:type="spellEnd"/>
+      <w:proofErr w:type="spellStart"/>
+      <w:proofErr w:type="spellEnd"/>
+      <w:proofErr w:type="spellStart"/>
+      <w:proofErr w:type="spellEnd"/>
+    </w:p>
+    <w:p>
+      <w:r>
+        <w:t xml:space="preserve">+++END-IF+++</w:t>
+      </w:r>
+    </w:p>
+    <w:p>
+      <w:r>
+        <w:t xml:space="preserve">+++IF $a.niveau === 3+++</w:t>
       </w:r>
     </w:p>
     <w:p>

</xml_diff>